<commit_message>
Update 2. Role based Security.docx
</commit_message>
<xml_diff>
--- a/Day 4/Labs/2. Role based Security.docx
+++ b/Day 4/Labs/2. Role based Security.docx
@@ -808,18 +808,20 @@
         </w:rPr>
         <w:t>, which always returns the user in the format of their user principal name, </w:t>
       </w:r>
-      <w:r>
-        <w:rPr>
-          <w:rFonts w:ascii="Segoe UI" w:eastAsia="Times New Roman" w:hAnsi="Segoe UI" w:cs="Segoe UI"/>
-          <w:i/>
-          <w:iCs/>
-          <w:color w:val="171717"/>
-          <w:sz w:val="24"/>
-          <w:szCs w:val="24"/>
-          <w:lang w:eastAsia="en-GB"/>
-        </w:rPr>
-        <w:t>username@contoso.com</w:t>
-      </w:r>
+      <w:hyperlink r:id="rId7" w:history="1">
+        <w:r>
+          <w:rPr>
+            <w:rStyle w:val="Hyperlink"/>
+            <w:rFonts w:ascii="Segoe UI" w:eastAsia="Times New Roman" w:hAnsi="Segoe UI" w:cs="Segoe UI"/>
+            <w:i/>
+            <w:iCs/>
+            <w:sz w:val="24"/>
+            <w:szCs w:val="24"/>
+            <w:lang w:eastAsia="en-GB"/>
+          </w:rPr>
+          <w:t>username@contoso.com</w:t>
+        </w:r>
+      </w:hyperlink>
       <w:r>
         <w:rPr>
           <w:rFonts w:ascii="Segoe UI" w:eastAsia="Times New Roman" w:hAnsi="Segoe UI" w:cs="Segoe UI"/>
@@ -829,6 +831,64 @@
           <w:lang w:eastAsia="en-GB"/>
         </w:rPr>
         <w:t>.</w:t>
+      </w:r>
+    </w:p>
+    <w:p>
+      <w:pPr>
+        <w:shd w:val="clear" w:color="auto" w:fill="FFFFFF"/>
+        <w:spacing w:before="100" w:beforeAutospacing="1" w:after="100" w:afterAutospacing="1" w:line="240" w:lineRule="auto"/>
+        <w:ind w:left="570"/>
+        <w:rPr>
+          <w:rFonts w:ascii="Segoe UI" w:eastAsia="Times New Roman" w:hAnsi="Segoe UI" w:cs="Segoe UI"/>
+          <w:color w:val="171717"/>
+          <w:sz w:val="24"/>
+          <w:szCs w:val="24"/>
+          <w:lang w:eastAsia="en-GB"/>
+        </w:rPr>
+      </w:pPr>
+      <w:r>
+        <w:rPr>
+          <w:rFonts w:ascii="Segoe UI" w:eastAsia="Times New Roman" w:hAnsi="Segoe UI" w:cs="Segoe UI"/>
+          <w:color w:val="171717"/>
+          <w:sz w:val="24"/>
+          <w:szCs w:val="24"/>
+          <w:lang w:eastAsia="en-GB"/>
+        </w:rPr>
+        <w:drawing>
+          <wp:inline distT="0" distB="0" distL="0" distR="0" wp14:anchorId="7CBBBF78" wp14:editId="4205DFE6">
+            <wp:extent cx="5731510" cy="3406140"/>
+            <wp:effectExtent l="0" t="0" r="2540" b="3810"/>
+            <wp:docPr id="1079701118" name="Picture 1" descr="A screenshot of a computer&#10;&#10;AI-generated content may be incorrect."/>
+            <wp:cNvGraphicFramePr>
+              <a:graphicFrameLocks xmlns:a="http://schemas.openxmlformats.org/drawingml/2006/main" noChangeAspect="1"/>
+            </wp:cNvGraphicFramePr>
+            <a:graphic xmlns:a="http://schemas.openxmlformats.org/drawingml/2006/main">
+              <a:graphicData uri="http://schemas.openxmlformats.org/drawingml/2006/picture">
+                <pic:pic xmlns:pic="http://schemas.openxmlformats.org/drawingml/2006/picture">
+                  <pic:nvPicPr>
+                    <pic:cNvPr id="1079701118" name="Picture 1" descr="A screenshot of a computer&#10;&#10;AI-generated content may be incorrect."/>
+                    <pic:cNvPicPr/>
+                  </pic:nvPicPr>
+                  <pic:blipFill>
+                    <a:blip r:embed="rId8"/>
+                    <a:stretch>
+                      <a:fillRect/>
+                    </a:stretch>
+                  </pic:blipFill>
+                  <pic:spPr>
+                    <a:xfrm>
+                      <a:off x="0" y="0"/>
+                      <a:ext cx="5731510" cy="3406140"/>
+                    </a:xfrm>
+                    <a:prstGeom prst="rect">
+                      <a:avLst/>
+                    </a:prstGeom>
+                  </pic:spPr>
+                </pic:pic>
+              </a:graphicData>
+            </a:graphic>
+          </wp:inline>
+        </w:drawing>
       </w:r>
     </w:p>
     <w:p>
@@ -899,7 +959,7 @@
                     </pic:cNvPicPr>
                   </pic:nvPicPr>
                   <pic:blipFill>
-                    <a:blip r:embed="rId7">
+                    <a:blip r:embed="rId9">
                       <a:extLst>
                         <a:ext uri="{28A0092B-C50C-407E-A947-70E740481C1C}">
                           <a14:useLocalDpi xmlns:a14="http://schemas.microsoft.com/office/drawing/2010/main" val="0"/>
@@ -1049,6 +1109,7 @@
           <w:rFonts w:ascii="Segoe UI" w:hAnsi="Segoe UI" w:cs="Segoe UI"/>
           <w:color w:val="171717"/>
         </w:rPr>
+        <w:lastRenderedPageBreak/>
         <w:t>Validate the roles within Power BI Desktop</w:t>
       </w:r>
     </w:p>
@@ -1155,7 +1216,7 @@
                     </pic:cNvPicPr>
                   </pic:nvPicPr>
                   <pic:blipFill>
-                    <a:blip r:embed="rId8">
+                    <a:blip r:embed="rId10">
                       <a:extLst>
                         <a:ext uri="{28A0092B-C50C-407E-A947-70E740481C1C}">
                           <a14:useLocalDpi xmlns:a14="http://schemas.microsoft.com/office/drawing/2010/main" val="0"/>
@@ -1236,7 +1297,6 @@
           <w:noProof/>
           <w:color w:val="171717"/>
         </w:rPr>
-        <w:lastRenderedPageBreak/>
         <w:drawing>
           <wp:inline distT="0" distB="0" distL="0" distR="0" wp14:anchorId="24F29C05" wp14:editId="595DEEAB">
             <wp:extent cx="2034540" cy="1554480"/>
@@ -1255,7 +1315,7 @@
                     </pic:cNvPicPr>
                   </pic:nvPicPr>
                   <pic:blipFill>
-                    <a:blip r:embed="rId9">
+                    <a:blip r:embed="rId11">
                       <a:extLst>
                         <a:ext uri="{28A0092B-C50C-407E-A947-70E740481C1C}">
                           <a14:useLocalDpi xmlns:a14="http://schemas.microsoft.com/office/drawing/2010/main" val="0"/>
@@ -1413,7 +1473,7 @@
                     </pic:cNvPicPr>
                   </pic:nvPicPr>
                   <pic:blipFill>
-                    <a:blip r:embed="rId10">
+                    <a:blip r:embed="rId12">
                       <a:extLst>
                         <a:ext uri="{28A0092B-C50C-407E-A947-70E740481C1C}">
                           <a14:useLocalDpi xmlns:a14="http://schemas.microsoft.com/office/drawing/2010/main" val="0"/>
@@ -1569,6 +1629,7 @@
           <w:rFonts w:ascii="Segoe UI" w:hAnsi="Segoe UI" w:cs="Segoe UI"/>
           <w:color w:val="171717"/>
         </w:rPr>
+        <w:lastRenderedPageBreak/>
         <w:t>Manage security on your model</w:t>
       </w:r>
     </w:p>
@@ -1676,9 +1737,9 @@
       <w:r>
         <w:rPr>
           <w:rFonts w:ascii="Segoe UI" w:hAnsi="Segoe UI" w:cs="Segoe UI"/>
-          <w:color w:val="171717"/>
-        </w:rPr>
-        <w:lastRenderedPageBreak/>
+          <w:noProof/>
+          <w:color w:val="171717"/>
+        </w:rPr>
         <w:drawing>
           <wp:inline distT="0" distB="0" distL="0" distR="0" wp14:anchorId="321C6F97" wp14:editId="6B3E8821">
             <wp:extent cx="2790825" cy="3387578"/>
@@ -1695,7 +1756,7 @@
                     <pic:cNvPicPr/>
                   </pic:nvPicPr>
                   <pic:blipFill>
-                    <a:blip r:embed="rId11"/>
+                    <a:blip r:embed="rId13"/>
                     <a:stretch>
                       <a:fillRect/>
                     </a:stretch>
@@ -1802,7 +1863,7 @@
         </w:rPr>
         <w:t>You can add a member to the role by typing in the email address, or name, of the user, security group or distribution list you want to add. You cannot add Groups created within Power BI. You can add members </w:t>
       </w:r>
-      <w:hyperlink r:id="rId12" w:anchor="data-security-for-external-partners" w:history="1">
+      <w:hyperlink r:id="rId14" w:anchor="data-security-for-external-partners" w:history="1">
         <w:r>
           <w:rPr>
             <w:rStyle w:val="Hyperlink"/>
@@ -1831,8 +1892,10 @@
       <w:r>
         <w:rPr>
           <w:rFonts w:ascii="Segoe UI" w:hAnsi="Segoe UI" w:cs="Segoe UI"/>
-          <w:color w:val="171717"/>
-        </w:rPr>
+          <w:noProof/>
+          <w:color w:val="171717"/>
+        </w:rPr>
+        <w:lastRenderedPageBreak/>
         <w:drawing>
           <wp:inline distT="0" distB="0" distL="0" distR="0" wp14:anchorId="18631300" wp14:editId="5053E53D">
             <wp:extent cx="5731510" cy="2431415"/>
@@ -1849,7 +1912,7 @@
                     <pic:cNvPicPr/>
                   </pic:nvPicPr>
                   <pic:blipFill>
-                    <a:blip r:embed="rId13"/>
+                    <a:blip r:embed="rId15"/>
                     <a:stretch>
                       <a:fillRect/>
                     </a:stretch>
@@ -1884,7 +1947,6 @@
           <w:rFonts w:ascii="Segoe UI" w:hAnsi="Segoe UI" w:cs="Segoe UI"/>
           <w:color w:val="171717"/>
         </w:rPr>
-        <w:lastRenderedPageBreak/>
         <w:t>You can also see how many members are part of the role by the number in parenthesis next to the role name, or next to Members.</w:t>
       </w:r>
     </w:p>
@@ -1921,7 +1983,7 @@
                     </pic:cNvPicPr>
                   </pic:nvPicPr>
                   <pic:blipFill>
-                    <a:blip r:embed="rId14">
+                    <a:blip r:embed="rId16">
                       <a:extLst>
                         <a:ext uri="{28A0092B-C50C-407E-A947-70E740481C1C}">
                           <a14:useLocalDpi xmlns:a14="http://schemas.microsoft.com/office/drawing/2010/main" val="0"/>
@@ -2021,7 +2083,7 @@
                     </pic:cNvPicPr>
                   </pic:nvPicPr>
                   <pic:blipFill>
-                    <a:blip r:embed="rId15">
+                    <a:blip r:embed="rId17">
                       <a:extLst>
                         <a:ext uri="{28A0092B-C50C-407E-A947-70E740481C1C}">
                           <a14:useLocalDpi xmlns:a14="http://schemas.microsoft.com/office/drawing/2010/main" val="0"/>
@@ -2144,6 +2206,7 @@
           <w:rFonts w:ascii="Segoe UI" w:hAnsi="Segoe UI" w:cs="Segoe UI"/>
           <w:color w:val="171717"/>
         </w:rPr>
+        <w:lastRenderedPageBreak/>
         <w:t>Select </w:t>
       </w:r>
       <w:r>
@@ -2188,7 +2251,7 @@
                     </pic:cNvPicPr>
                   </pic:nvPicPr>
                   <pic:blipFill>
-                    <a:blip r:embed="rId16">
+                    <a:blip r:embed="rId18">
                       <a:extLst>
                         <a:ext uri="{28A0092B-C50C-407E-A947-70E740481C1C}">
                           <a14:useLocalDpi xmlns:a14="http://schemas.microsoft.com/office/drawing/2010/main" val="0"/>
@@ -2249,9 +2312,9 @@
       <w:r>
         <w:rPr>
           <w:rFonts w:ascii="Segoe UI" w:hAnsi="Segoe UI" w:cs="Segoe UI"/>
-          <w:color w:val="171717"/>
-        </w:rPr>
-        <w:lastRenderedPageBreak/>
+          <w:noProof/>
+          <w:color w:val="171717"/>
+        </w:rPr>
         <w:drawing>
           <wp:inline distT="0" distB="0" distL="0" distR="0" wp14:anchorId="202AAE3E" wp14:editId="076CABCA">
             <wp:extent cx="5731510" cy="3011805"/>
@@ -2268,7 +2331,7 @@
                     <pic:cNvPicPr/>
                   </pic:nvPicPr>
                   <pic:blipFill>
-                    <a:blip r:embed="rId17"/>
+                    <a:blip r:embed="rId19"/>
                     <a:stretch>
                       <a:fillRect/>
                     </a:stretch>
@@ -2333,6 +2396,7 @@
       <w:r>
         <w:rPr>
           <w:rFonts w:ascii="Segoe UI" w:hAnsi="Segoe UI" w:cs="Segoe UI"/>
+          <w:noProof/>
           <w:color w:val="171717"/>
         </w:rPr>
         <w:drawing>
@@ -2351,7 +2415,7 @@
                     <pic:cNvPicPr/>
                   </pic:nvPicPr>
                   <pic:blipFill>
-                    <a:blip r:embed="rId18"/>
+                    <a:blip r:embed="rId20"/>
                     <a:stretch>
                       <a:fillRect/>
                     </a:stretch>
@@ -2386,6 +2450,7 @@
           <w:rFonts w:ascii="Segoe UI" w:hAnsi="Segoe UI" w:cs="Segoe UI"/>
           <w:color w:val="171717"/>
         </w:rPr>
+        <w:lastRenderedPageBreak/>
         <w:t>You can choose to view data as a specific person, or you can select a combination of available roles to validate they are working.</w:t>
       </w:r>
     </w:p>
@@ -3469,12 +3534,23 @@
     <w:name w:val="Hyperlink"/>
     <w:basedOn w:val="DefaultParagraphFont"/>
     <w:uiPriority w:val="99"/>
-    <w:semiHidden/>
     <w:unhideWhenUsed/>
     <w:rsid w:val="00340440"/>
     <w:rPr>
       <w:color w:val="0000FF"/>
       <w:u w:val="single"/>
+    </w:rPr>
+  </w:style>
+  <w:style w:type="character" w:styleId="UnresolvedMention">
+    <w:name w:val="Unresolved Mention"/>
+    <w:basedOn w:val="DefaultParagraphFont"/>
+    <w:uiPriority w:val="99"/>
+    <w:semiHidden/>
+    <w:unhideWhenUsed/>
+    <w:rsid w:val="003971CD"/>
+    <w:rPr>
+      <w:color w:val="605E5C"/>
+      <w:shd w:val="clear" w:color="auto" w:fill="E1DFDD"/>
     </w:rPr>
   </w:style>
 </w:styles>

</xml_diff>